<commit_message>
small padding tweak on mobile on the home page
</commit_message>
<xml_diff>
--- a/public/downloads/CV-Jonas-Deschaek.docx
+++ b/public/downloads/CV-Jonas-Deschaek.docx
@@ -185,13 +185,13 @@
                 <w:noProof/>
               </w:rPr>
               <w:drawing>
-                <wp:anchor distT="0" distB="0" distL="114300" distR="114300" simplePos="0" relativeHeight="251662336" behindDoc="0" locked="0" layoutInCell="1" allowOverlap="1" wp14:anchorId="660929EE" wp14:editId="7BF35FB3">
+                <wp:anchor distT="0" distB="0" distL="114300" distR="114300" simplePos="0" relativeHeight="251662336" behindDoc="0" locked="0" layoutInCell="1" allowOverlap="1" wp14:anchorId="660929EE" wp14:editId="0719C2BA">
                   <wp:simplePos x="0" y="0"/>
                   <wp:positionH relativeFrom="column">
-                    <wp:posOffset>0</wp:posOffset>
+                    <wp:posOffset>230</wp:posOffset>
                   </wp:positionH>
                   <wp:positionV relativeFrom="paragraph">
-                    <wp:posOffset>-55880</wp:posOffset>
+                    <wp:posOffset>-126713</wp:posOffset>
                   </wp:positionV>
                   <wp:extent cx="1470660" cy="1723659"/>
                   <wp:effectExtent l="0" t="0" r="0" b="0"/>
@@ -209,7 +209,7 @@
                             <a:picLocks noChangeAspect="1" noChangeArrowheads="1"/>
                           </pic:cNvPicPr>
                         </pic:nvPicPr>
-                        <pic:blipFill>
+                        <pic:blipFill rotWithShape="1">
                           <a:blip r:embed="rId11" cstate="print">
                             <a:extLst>
                               <a:ext uri="{28A0092B-C50C-407E-A947-70E740481C1C}">
@@ -217,7 +217,7 @@
                               </a:ext>
                             </a:extLst>
                           </a:blip>
-                          <a:srcRect/>
+                          <a:srcRect l="7883" r="-7883"/>
                           <a:stretch>
                             <a:fillRect/>
                           </a:stretch>
@@ -227,13 +227,16 @@
                             <a:off x="0" y="0"/>
                             <a:ext cx="1470660" cy="1723659"/>
                           </a:xfrm>
-                          <a:prstGeom prst="rect">
+                          <a:prstGeom prst="ellipse">
                             <a:avLst/>
                           </a:prstGeom>
                           <a:noFill/>
                           <a:ln>
                             <a:noFill/>
                           </a:ln>
+                          <a:effectLst>
+                            <a:softEdge rad="63500"/>
+                          </a:effectLst>
                         </pic:spPr>
                       </pic:pic>
                     </a:graphicData>
@@ -767,7 +770,19 @@
               <w:rPr>
                 <w:lang w:val="nl-BE"/>
               </w:rPr>
-              <w:t>Kartonage Medewerker</w:t>
+              <w:t>Karto</w:t>
+            </w:r>
+            <w:r>
+              <w:rPr>
+                <w:lang w:val="nl-BE"/>
+              </w:rPr>
+              <w:t>n</w:t>
+            </w:r>
+            <w:r>
+              <w:rPr>
+                <w:lang w:val="nl-BE"/>
+              </w:rPr>
+              <w:t>nage Medewerker</w:t>
             </w:r>
           </w:p>
           <w:p>
@@ -786,7 +801,19 @@
               <w:rPr>
                 <w:lang w:val="nl-BE"/>
               </w:rPr>
-              <w:t>vakantie werk ik in het kartonage bedrijf Kartonage L</w:t>
+              <w:t>vakantie werk ik in het karto</w:t>
+            </w:r>
+            <w:r>
+              <w:rPr>
+                <w:lang w:val="nl-BE"/>
+              </w:rPr>
+              <w:t>n</w:t>
+            </w:r>
+            <w:r>
+              <w:rPr>
+                <w:lang w:val="nl-BE"/>
+              </w:rPr>
+              <w:t>nage bedrijf Kartonage L</w:t>
             </w:r>
             <w:r>
               <w:rPr>
@@ -1488,26 +1515,6 @@
               <w:t>kills en kan mezelf goed verwoorden.</w:t>
             </w:r>
           </w:p>
-          <w:p>
-            <w:pPr>
-              <w:pStyle w:val="ListBullet"/>
-              <w:rPr>
-                <w:lang w:val="nl-BE"/>
-              </w:rPr>
-            </w:pPr>
-            <w:r>
-              <w:rPr>
-                <w:lang w:val="nl-BE"/>
-              </w:rPr>
-              <w:t>Ik ben een echte w</w:t>
-            </w:r>
-            <w:r>
-              <w:rPr>
-                <w:lang w:val="nl-BE"/>
-              </w:rPr>
-              <w:t>orkaholic</w:t>
-            </w:r>
-          </w:p>
         </w:tc>
         <w:tc>
           <w:tcPr>
@@ -1546,7 +1553,13 @@
               <w:rPr>
                 <w:lang w:val="nl-BE"/>
               </w:rPr>
-              <w:t>Gym’mer</w:t>
+              <w:t>g</w:t>
+            </w:r>
+            <w:r>
+              <w:rPr>
+                <w:lang w:val="nl-BE"/>
+              </w:rPr>
+              <w:t>ymmer</w:t>
             </w:r>
           </w:p>
           <w:p>
@@ -1564,7 +1577,25 @@
               <w:rPr>
                 <w:lang w:val="nl-BE"/>
               </w:rPr>
-              <w:t>Dungeon Master bij 2 dungeon &amp; Dragons groepen waar ik verhalen, en spel avonden voor schrijf</w:t>
+              <w:t>Game</w:t>
+            </w:r>
+            <w:r>
+              <w:rPr>
+                <w:lang w:val="nl-BE"/>
+              </w:rPr>
+              <w:t xml:space="preserve">Master bij 2 </w:t>
+            </w:r>
+            <w:r>
+              <w:rPr>
+                <w:lang w:val="nl-BE"/>
+              </w:rPr>
+              <w:t>D</w:t>
+            </w:r>
+            <w:r>
+              <w:rPr>
+                <w:lang w:val="nl-BE"/>
+              </w:rPr>
+              <w:t>ungeon &amp; Dragons groepen waar ik verhalen, en spel avonden voor schrijf</w:t>
             </w:r>
           </w:p>
           <w:p>
@@ -1582,7 +1613,7 @@
               <w:rPr>
                 <w:lang w:val="nl-BE"/>
               </w:rPr>
-              <w:t>Toneel groep “Kloar Bie Doage”</w:t>
+              <w:t>Monitor bij Jomba: waar we jongeren met ene handicap en spetterende vakantie bezorgen!</w:t>
             </w:r>
           </w:p>
           <w:p>
@@ -3367,8 +3398,10 @@
     <w:rsidRoot w:val="00526620"/>
     <w:rsid w:val="002D7536"/>
     <w:rsid w:val="00526620"/>
+    <w:rsid w:val="008204B1"/>
     <w:rsid w:val="008D05CC"/>
     <w:rsid w:val="009741F9"/>
+    <w:rsid w:val="0099349D"/>
     <w:rsid w:val="00B41432"/>
   </w:rsids>
   <m:mathPr>
@@ -4047,15 +4080,6 @@
 </file>
 
 <file path=customXml/item1.xml><?xml version="1.0" encoding="utf-8"?>
-<?mso-contentType ?>
-<FormTemplates xmlns="http://schemas.microsoft.com/sharepoint/v3/contenttype/forms">
-  <Display>DocumentLibraryForm</Display>
-  <Edit>DocumentLibraryForm</Edit>
-  <New>DocumentLibraryForm</New>
-</FormTemplates>
-</file>
-
-<file path=customXml/item2.xml><?xml version="1.0" encoding="utf-8"?>
 <p:properties xmlns:p="http://schemas.microsoft.com/office/2006/metadata/properties" xmlns:xsi="http://www.w3.org/2001/XMLSchema-instance" xmlns:pc="http://schemas.microsoft.com/office/infopath/2007/PartnerControls">
   <documentManagement>
     <_ip_UnifiedCompliancePolicyUIAction xmlns="http://schemas.microsoft.com/sharepoint/v3" xsi:nil="true"/>
@@ -4075,11 +4099,16 @@
 </p:properties>
 </file>
 
-<file path=customXml/item3.xml><?xml version="1.0" encoding="utf-8"?>
-<b:Sources xmlns:b="http://schemas.openxmlformats.org/officeDocument/2006/bibliography" xmlns="http://schemas.openxmlformats.org/officeDocument/2006/bibliography" SelectedStyle="\APASixthEditionOfficeOnline.xsl" StyleName="APA" Version="6"/>
+<file path=customXml/item2.xml><?xml version="1.0" encoding="utf-8"?>
+<?mso-contentType ?>
+<FormTemplates xmlns="http://schemas.microsoft.com/sharepoint/v3/contenttype/forms">
+  <Display>DocumentLibraryForm</Display>
+  <Edit>DocumentLibraryForm</Edit>
+  <New>DocumentLibraryForm</New>
+</FormTemplates>
 </file>
 
-<file path=customXml/item4.xml><?xml version="1.0" encoding="utf-8"?>
+<file path=customXml/item3.xml><?xml version="1.0" encoding="utf-8"?>
 <ct:contentTypeSchema xmlns:ct="http://schemas.microsoft.com/office/2006/metadata/contentType" xmlns:ma="http://schemas.microsoft.com/office/2006/metadata/properties/metaAttributes" ct:_="" ma:_="" ma:contentTypeName="Document" ma:contentTypeID="0x01010079F111ED35F8CC479449609E8A0923A6" ma:contentTypeVersion="26" ma:contentTypeDescription="Create a new document." ma:contentTypeScope="" ma:versionID="ac37c1753acd5e330d2062ccec26ea66">
   <xsd:schema xmlns:xsd="http://www.w3.org/2001/XMLSchema" xmlns:xs="http://www.w3.org/2001/XMLSchema" xmlns:p="http://schemas.microsoft.com/office/2006/metadata/properties" xmlns:ns1="http://schemas.microsoft.com/sharepoint/v3" xmlns:ns2="71af3243-3dd4-4a8d-8c0d-dd76da1f02a5" xmlns:ns3="16c05727-aa75-4e4a-9b5f-8a80a1165891" xmlns:ns4="230e9df3-be65-4c73-a93b-d1236ebd677e" targetNamespace="http://schemas.microsoft.com/office/2006/metadata/properties" ma:root="true" ma:fieldsID="3b340c7101c92c5120abd06486f94548" ns1:_="" ns2:_="" ns3:_="" ns4:_="">
     <xsd:import namespace="http://schemas.microsoft.com/sharepoint/v3"/>
@@ -4379,15 +4408,11 @@
 </ct:contentTypeSchema>
 </file>
 
-<file path=customXml/itemProps1.xml><?xml version="1.0" encoding="utf-8"?>
-<ds:datastoreItem xmlns:ds="http://schemas.openxmlformats.org/officeDocument/2006/customXml" ds:itemID="{F92B5545-C6DB-4085-9421-CD6312983A27}">
-  <ds:schemaRefs>
-    <ds:schemaRef ds:uri="http://schemas.microsoft.com/sharepoint/v3/contenttype/forms"/>
-  </ds:schemaRefs>
-</ds:datastoreItem>
+<file path=customXml/item4.xml><?xml version="1.0" encoding="utf-8"?>
+<b:Sources xmlns:b="http://schemas.openxmlformats.org/officeDocument/2006/bibliography" xmlns="http://schemas.openxmlformats.org/officeDocument/2006/bibliography" SelectedStyle="\APASixthEditionOfficeOnline.xsl" StyleName="APA" Version="6"/>
 </file>
 
-<file path=customXml/itemProps2.xml><?xml version="1.0" encoding="utf-8"?>
+<file path=customXml/itemProps1.xml><?xml version="1.0" encoding="utf-8"?>
 <ds:datastoreItem xmlns:ds="http://schemas.openxmlformats.org/officeDocument/2006/customXml" ds:itemID="{DE837FAA-7F48-4B26-9FA1-452A5FFF62E8}">
   <ds:schemaRefs>
     <ds:schemaRef ds:uri="http://schemas.microsoft.com/office/2006/metadata/properties"/>
@@ -4399,15 +4424,15 @@
 </ds:datastoreItem>
 </file>
 
-<file path=customXml/itemProps3.xml><?xml version="1.0" encoding="utf-8"?>
-<ds:datastoreItem xmlns:ds="http://schemas.openxmlformats.org/officeDocument/2006/customXml" ds:itemID="{DB8B18DF-AF6D-4733-ADC3-1A359FC5088D}">
+<file path=customXml/itemProps2.xml><?xml version="1.0" encoding="utf-8"?>
+<ds:datastoreItem xmlns:ds="http://schemas.openxmlformats.org/officeDocument/2006/customXml" ds:itemID="{F92B5545-C6DB-4085-9421-CD6312983A27}">
   <ds:schemaRefs>
-    <ds:schemaRef ds:uri="http://schemas.openxmlformats.org/officeDocument/2006/bibliography"/>
+    <ds:schemaRef ds:uri="http://schemas.microsoft.com/sharepoint/v3/contenttype/forms"/>
   </ds:schemaRefs>
 </ds:datastoreItem>
 </file>
 
-<file path=customXml/itemProps4.xml><?xml version="1.0" encoding="utf-8"?>
+<file path=customXml/itemProps3.xml><?xml version="1.0" encoding="utf-8"?>
 <ds:datastoreItem xmlns:ds="http://schemas.openxmlformats.org/officeDocument/2006/customXml" ds:itemID="{7134E7FB-4F26-4AD3-9776-A74D9B39B08D}">
   <ds:schemaRefs>
     <ds:schemaRef ds:uri="http://schemas.microsoft.com/office/2006/metadata/contentType"/>
@@ -4428,6 +4453,14 @@
 </ds:datastoreItem>
 </file>
 
+<file path=customXml/itemProps4.xml><?xml version="1.0" encoding="utf-8"?>
+<ds:datastoreItem xmlns:ds="http://schemas.openxmlformats.org/officeDocument/2006/customXml" ds:itemID="{DB8B18DF-AF6D-4733-ADC3-1A359FC5088D}">
+  <ds:schemaRefs>
+    <ds:schemaRef ds:uri="http://schemas.openxmlformats.org/officeDocument/2006/bibliography"/>
+  </ds:schemaRefs>
+</ds:datastoreItem>
+</file>
+
 <file path=docMetadata/LabelInfo.xml><?xml version="1.0" encoding="utf-8"?>
 <clbl:labelList xmlns:clbl="http://schemas.microsoft.com/office/2020/mipLabelMetadata"/>
 </file>
</xml_diff>